<commit_message>
Informe: problemática, pregunta y objetivos alineados con la presentación; limitaciones y trabajo futuro
</commit_message>
<xml_diff>
--- a/Informe_Proyecto2_Resultados.docx
+++ b/Informe_Proyecto2_Resultados.docx
@@ -186,7 +186,7 @@
           <w:color w:val="000000"/>
           <w:sz w:val="24"/>
         </w:rPr>
-        <w:t>15 de octubre de 2026</w:t>
+        <w:t>19 de octubre de 2026</w:t>
       </w:r>
     </w:p>
     <w:p>
@@ -243,6 +243,25 @@
           <w:color w:val="000000"/>
           <w:sz w:val="24"/>
         </w:rPr>
+        <w:t xml:space="preserve">Hoy cada pase, disputa y saque de banda de un partido lo anota una persona que revisa los 90 minutos de transmisión. Es un trabajo lento y caro que no escala a todos los partidos de todas las ligas. Este proyecto busca responder una pregunta concreta: </w:t>
+      </w:r>
+      <w:r>
+        <w:rPr>
+          <w:rFonts w:ascii="Times New Roman" w:hAnsi="Times New Roman" w:eastAsia="Times New Roman" w:cs="Times New Roman"/>
+          <w:b/>
+          <w:color w:val="000000"/>
+          <w:sz w:val="24"/>
+        </w:rPr>
+        <w:t>¿se puede reconocer automáticamente qué acción ocurre en una ventana de 1.6 s de transmisión?</w:t>
+      </w:r>
+    </w:p>
+    <w:p>
+      <w:r>
+        <w:rPr>
+          <w:rFonts w:ascii="Times New Roman" w:hAnsi="Times New Roman" w:eastAsia="Times New Roman" w:cs="Times New Roman"/>
+          <w:color w:val="000000"/>
+          <w:sz w:val="24"/>
+        </w:rPr>
         <w:t xml:space="preserve">En la fase de análisis exploratorio se caracterizaron los 200 clips de video de la Bundesliga y se confirmó que las señales visuales necesarias para reconocer acciones con balón están presentes: la cancha se aísla por color, los jugadores son detectables y el movimiento entre frames marca los momentos de acción. Esta fase de </w:t>
       </w:r>
       <w:r>
@@ -433,7 +452,7 @@
           <w:color w:val="000000"/>
           <w:sz w:val="24"/>
         </w:rPr>
-        <w:t xml:space="preserve"> Desarrollar y comparar modelos de clasificación que identifiquen la acción (pase, disputa, saque de banda o fondo) en subclips de video de la Bundesliga, evaluando su capacidad de generalizar a un partido no visto.</w:t>
+        <w:t xml:space="preserve"> Comparar modelos de clasificación de acciones (pase, disputa, saque de banda o fondo) en video de la Bundesliga según su capacidad de generalizar a un partido no visto.</w:t>
       </w:r>
     </w:p>
     <w:p>
@@ -457,7 +476,7 @@
           <w:color w:val="000000"/>
           <w:sz w:val="24"/>
         </w:rPr>
-        <w:t xml:space="preserve">Entrenar modelos tabulares (regresión logística, Random Forest y XGBoost) sobre las variables agregadas de cada subclip, ajustando sus hiperparámetros mediante validación cruzada por partido (GroupKFold sobre </w:t>
+        <w:t xml:space="preserve">Entrenar regresión logística, Random Forest y XGBoost sobre las variables agregadas de cada subclip, ajustando sus hiperparámetros con validación cruzada por partido (GroupKFold sobre </w:t>
       </w:r>
       <w:r>
         <w:rPr>
@@ -473,7 +492,7 @@
           <w:color w:val="000000"/>
           <w:sz w:val="24"/>
         </w:rPr>
-        <w:t>) con métrica F1 macro.</w:t>
+        <w:t>) y F1 macro como métrica.</w:t>
       </w:r>
     </w:p>
     <w:p>
@@ -486,7 +505,7 @@
           <w:color w:val="000000"/>
           <w:sz w:val="24"/>
         </w:rPr>
-        <w:t>Entrenar un modelo temporal (GRU) sobre la secuencia de embeddings de ResNet18 de los frames y compararlo con los modelos tabulares.</w:t>
+        <w:t>Entrenar un modelo temporal (GRU) sobre la secuencia de cuadros de cada ventana, representados con embeddings de ResNet18.</w:t>
       </w:r>
     </w:p>
     <w:p>
@@ -499,7 +518,7 @@
           <w:color w:val="000000"/>
           <w:sz w:val="24"/>
         </w:rPr>
-        <w:t>Evaluar todos los modelos en un partido de prueba retenido, reportando F1 macro, F1 por clase y matrices de confusión, e interpretar los errores.</w:t>
+        <w:t>Evaluar los cuatro modelos en un partido no visto mediante F1 macro, tomando el azar con cuatro clases (0.25) como referencia, e interpretar sus errores con el F1 por clase y las matrices de confusión.</w:t>
       </w:r>
     </w:p>
     <w:p>
@@ -512,7 +531,7 @@
           <w:color w:val="000000"/>
           <w:sz w:val="24"/>
         </w:rPr>
-        <w:t>Integrar el mejor modelo en una aplicación que permita explorar los datos y predecir la acción sobre video nuevo.</w:t>
+        <w:t>Integrar los modelos en una aplicación que clasifique video nuevo con el mismo preprocesamiento que el entrenamiento.</w:t>
       </w:r>
     </w:p>
     <w:p>
@@ -1645,7 +1664,7 @@
           <w:color w:val="000000"/>
           <w:sz w:val="24"/>
         </w:rPr>
-        <w:t>M4 Pro con 24 GB de memoria. YOLOv8 y ResNet18 corren en la GPU integrada mediante Metal (MPS) y los modelos se entrenan en CPU. No se necesitó GPU dedicada porque la CNN se usa congelada y los modelos de clasificación son pequeños; extraer las variables de una ventana tarda entre 0.4 y 2 s.</w:t>
+        <w:t>M4 Pro con 24 GB de memoria. YOLOv8 y ResNet18 corren en la GPU integrada mediante Metal (MPS) y los modelos se entrenan en CPU. No se necesitó GPU dedicada porque la CNN se usa congelada y los modelos de clasificación son pequeños; extraer las variables de una ventana tarda entre 0.4 y 2 s, y las de los 762 subclips, unos 7 minutos.</w:t>
       </w:r>
     </w:p>
     <w:p>
@@ -6512,7 +6531,7 @@
           <w:color w:val="000000"/>
           <w:sz w:val="24"/>
         </w:rPr>
-        <w:t xml:space="preserve"> con F1 macro, F1 por clase, matrices de confusión, curvas de precisión-recall, importancia por permutación y tiempos. </w:t>
+        <w:t xml:space="preserve"> con el azar (0.25) como referencia: F1 macro, F1 por clase, matrices de confusión, curvas de precisión-recall, importancia por permutación y tiempos. </w:t>
       </w:r>
       <w:r>
         <w:rPr>
@@ -6548,7 +6567,7 @@
           <w:color w:val="000000"/>
           <w:sz w:val="24"/>
         </w:rPr>
-        <w:t xml:space="preserve"> Se cumplió. La aplicación en Streamlit permite explorar las variables tras la limpieza, clasificar un video subido con uno, varios o todos los modelos (un momento o el video completo) y revisar el rendimiento en gráficas interactivas que se pueden ocultar. Se verificó que su preprocesamiento reproduce el del entrenamiento.</w:t>
+        <w:t xml:space="preserve"> Se cumplió. La aplicación en Streamlit integra los cuatro modelos y clasifica video nuevo con el mismo preprocesamiento que el entrenamiento. Permite explorar las variables tras la limpieza, clasificar un video subido con uno, varios o todos los modelos (un momento o el video completo) y revisar el rendimiento en gráficas interactivas que se pueden ocultar. Se verificó que su preprocesamiento reproduce el del entrenamiento.</w:t>
       </w:r>
     </w:p>
     <w:p>
@@ -6724,6 +6743,67 @@
       </w:r>
     </w:p>
     <w:p>
+      <w:r>
+        <w:rPr>
+          <w:rFonts w:ascii="Times New Roman" w:hAnsi="Times New Roman" w:eastAsia="Times New Roman" w:cs="Times New Roman"/>
+          <w:color w:val="000000"/>
+          <w:sz w:val="24"/>
+        </w:rPr>
+        <w:t xml:space="preserve">En respuesta a la pregunta planteada, sí es posible reconocer de forma automática parte de las acciones en una ventana de 1.6 s —el pase y el saque de banda mejor que el azar—, pero no la disputa. Tres limitaciones de los datos explican buena parte del resultado: los subclips </w:t>
+      </w:r>
+      <w:r>
+        <w:rPr>
+          <w:rFonts w:ascii="Times New Roman" w:hAnsi="Times New Roman" w:eastAsia="Times New Roman" w:cs="Times New Roman"/>
+          <w:b/>
+          <w:color w:val="000000"/>
+          <w:sz w:val="24"/>
+        </w:rPr>
+        <w:t>terminan justo en el evento</w:t>
+      </w:r>
+      <w:r>
+        <w:rPr>
+          <w:rFonts w:ascii="Times New Roman" w:hAnsi="Times New Roman" w:eastAsia="Times New Roman" w:cs="Times New Roman"/>
+          <w:color w:val="000000"/>
+          <w:sz w:val="24"/>
+        </w:rPr>
+        <w:t xml:space="preserve">, por lo que no hay contexto de lo que ocurre después; el </w:t>
+      </w:r>
+      <w:r>
+        <w:rPr>
+          <w:rFonts w:ascii="Times New Roman" w:hAnsi="Times New Roman" w:eastAsia="Times New Roman" w:cs="Times New Roman"/>
+          <w:b/>
+          <w:color w:val="000000"/>
+          <w:sz w:val="24"/>
+        </w:rPr>
+        <w:t>balón casi no se detecta</w:t>
+      </w:r>
+      <w:r>
+        <w:rPr>
+          <w:rFonts w:ascii="Times New Roman" w:hAnsi="Times New Roman" w:eastAsia="Times New Roman" w:cs="Times New Roman"/>
+          <w:color w:val="000000"/>
+          <w:sz w:val="24"/>
+        </w:rPr>
+        <w:t xml:space="preserve">, porque ocupa muy pocos píxeles en el plano general; y solo hubo </w:t>
+      </w:r>
+      <w:r>
+        <w:rPr>
+          <w:rFonts w:ascii="Times New Roman" w:hAnsi="Times New Roman" w:eastAsia="Times New Roman" w:cs="Times New Roman"/>
+          <w:b/>
+          <w:color w:val="000000"/>
+          <w:sz w:val="24"/>
+        </w:rPr>
+        <w:t>siete partidos</w:t>
+      </w:r>
+      <w:r>
+        <w:rPr>
+          <w:rFonts w:ascii="Times New Roman" w:hAnsi="Times New Roman" w:eastAsia="Times New Roman" w:cs="Times New Roman"/>
+          <w:color w:val="000000"/>
+          <w:sz w:val="24"/>
+        </w:rPr>
+        <w:t xml:space="preserve"> para entrenar.</w:t>
+      </w:r>
+    </w:p>
+    <w:p>
       <w:pPr>
         <w:pStyle w:val="Heading2"/>
       </w:pPr>
@@ -6829,6 +6909,28 @@
           <w:sz w:val="24"/>
         </w:rPr>
         <w:t>) para describir la interacción que define una disputa o un pase.</w:t>
+      </w:r>
+    </w:p>
+    <w:p>
+      <w:pPr>
+        <w:pStyle w:val="ListNumber"/>
+      </w:pPr>
+      <w:r>
+        <w:rPr>
+          <w:rFonts w:ascii="Times New Roman" w:hAnsi="Times New Roman" w:eastAsia="Times New Roman" w:cs="Times New Roman"/>
+          <w:b/>
+          <w:color w:val="000000"/>
+          <w:sz w:val="24"/>
+        </w:rPr>
+        <w:t>Contexto después del evento</w:t>
+      </w:r>
+      <w:r>
+        <w:rPr>
+          <w:rFonts w:ascii="Times New Roman" w:hAnsi="Times New Roman" w:eastAsia="Times New Roman" w:cs="Times New Roman"/>
+          <w:color w:val="000000"/>
+          <w:sz w:val="24"/>
+        </w:rPr>
+        <w:t>: recortar ventanas que incluyan los cuadros posteriores a la acción (el destino del pase, el resultado de la disputa), que hoy no están en los subclips.</w:t>
       </w:r>
     </w:p>
     <w:p>

</xml_diff>